<commit_message>
Add comprehensive documentation and reports for the ride-hailing application
- Introduced Section 10: Results & Screenshots, detailing working modules, successful operations, and final functioning of the web app, along with visual evidence.
- Added Section 11: Conclusion, summarizing key learnings, achievements, and skills developed during the project.
- Included Section 12: Future Enhancements, outlining potential improvements for robustness, user-friendliness, and scalability.
- Compiled Section 13: References, listing resources, documentation, and external services utilized.
- Created Section 14: Appendix / Annexure, featuring important code samples and a link to the GitHub repository.
- Established a Table of Contents in both DOCX and PDF formats for easy navigation of the report.
</commit_message>
<xml_diff>
--- a/Report/2_Bonafide.docx
+++ b/Report/2_Bonafide.docx
@@ -102,6 +102,7 @@
         </w:rPr>
         <w:t xml:space="preserve">This is to certify that the project titled </w:t>
       </w:r>
+      <w:proofErr w:type="gramStart"/>
       <w:r>
         <w:rPr>
           <w:rStyle w:val="Strong"/>
@@ -110,6 +111,7 @@
         </w:rPr>
         <w:t>“______________________”</w:t>
       </w:r>
+      <w:proofErr w:type="gramEnd"/>
       <w:r>
         <w:rPr>
           <w:sz w:val="28"/>
@@ -285,16 +287,26 @@
           <w:sz w:val="28"/>
           <w:szCs w:val="28"/>
         </w:rPr>
-        <w:t>Full Stack Development Lab</w:t>
-      </w:r>
+        <w:t xml:space="preserve">Full Stack </w:t>
+      </w:r>
+      <w:proofErr w:type="gramStart"/>
       <w:r>
         <w:rPr>
           <w:rStyle w:val="Strong"/>
           <w:sz w:val="28"/>
           <w:szCs w:val="28"/>
         </w:rPr>
+        <w:t>Development Lab</w:t>
+      </w:r>
+      <w:r>
+        <w:rPr>
+          <w:rStyle w:val="Strong"/>
+          <w:sz w:val="28"/>
+          <w:szCs w:val="28"/>
+        </w:rPr>
         <w:t>oratory</w:t>
       </w:r>
+      <w:proofErr w:type="gramEnd"/>
       <w:r>
         <w:rPr>
           <w:rStyle w:val="Strong"/>
@@ -425,8 +437,19 @@
           <w:sz w:val="28"/>
           <w:szCs w:val="28"/>
         </w:rPr>
-        <w:t>Faculty Incharge</w:t>
-      </w:r>
+        <w:t xml:space="preserve">Faculty </w:t>
+      </w:r>
+      <w:proofErr w:type="spellStart"/>
+      <w:r>
+        <w:rPr>
+          <w:b/>
+          <w:bCs/>
+          <w:sz w:val="28"/>
+          <w:szCs w:val="28"/>
+        </w:rPr>
+        <w:t>Incharge</w:t>
+      </w:r>
+      <w:proofErr w:type="spellEnd"/>
     </w:p>
     <w:p>
       <w:pPr>
@@ -638,8 +661,19 @@
           <w:sz w:val="28"/>
           <w:szCs w:val="28"/>
         </w:rPr>
-        <w:t>Dr. J. Akilandeswari</w:t>
-      </w:r>
+        <w:t xml:space="preserve">Dr. J. </w:t>
+      </w:r>
+      <w:proofErr w:type="spellStart"/>
+      <w:r>
+        <w:rPr>
+          <w:b/>
+          <w:bCs/>
+          <w:sz w:val="28"/>
+          <w:szCs w:val="28"/>
+        </w:rPr>
+        <w:t>Akilandeswari</w:t>
+      </w:r>
+      <w:proofErr w:type="spellEnd"/>
     </w:p>
     <w:p>
       <w:pPr>
@@ -999,6 +1033,7 @@
         </w:rPr>
         <w:t xml:space="preserve"> </w:t>
       </w:r>
+      <w:proofErr w:type="spellStart"/>
       <w:r>
         <w:rPr>
           <w:b/>
@@ -1008,6 +1043,7 @@
         </w:rPr>
         <w:t>Valliappa</w:t>
       </w:r>
+      <w:proofErr w:type="spellEnd"/>
       <w:r>
         <w:rPr>
           <w:sz w:val="28"/>
@@ -1045,14 +1081,54 @@
           <w:sz w:val="28"/>
           <w:szCs w:val="28"/>
         </w:rPr>
-        <w:t>Sri. Chocko Valliappa</w:t>
-      </w:r>
-      <w:r>
-        <w:rPr>
-          <w:sz w:val="28"/>
-          <w:szCs w:val="28"/>
-        </w:rPr>
-        <w:t xml:space="preserve"> for providing adequate facilities to complete the project.</w:t>
+        <w:t xml:space="preserve">Sri. </w:t>
+      </w:r>
+      <w:proofErr w:type="spellStart"/>
+      <w:r>
+        <w:rPr>
+          <w:b/>
+          <w:bCs/>
+          <w:sz w:val="28"/>
+          <w:szCs w:val="28"/>
+        </w:rPr>
+        <w:t>Chocko</w:t>
+      </w:r>
+      <w:proofErr w:type="spellEnd"/>
+      <w:r>
+        <w:rPr>
+          <w:b/>
+          <w:bCs/>
+          <w:sz w:val="28"/>
+          <w:szCs w:val="28"/>
+        </w:rPr>
+        <w:t xml:space="preserve"> </w:t>
+      </w:r>
+      <w:proofErr w:type="spellStart"/>
+      <w:proofErr w:type="gramStart"/>
+      <w:r>
+        <w:rPr>
+          <w:b/>
+          <w:bCs/>
+          <w:sz w:val="28"/>
+          <w:szCs w:val="28"/>
+        </w:rPr>
+        <w:t>Valliappa</w:t>
+      </w:r>
+      <w:proofErr w:type="spellEnd"/>
+      <w:r>
+        <w:rPr>
+          <w:sz w:val="28"/>
+          <w:szCs w:val="28"/>
+        </w:rPr>
+        <w:t xml:space="preserve"> for providing</w:t>
+      </w:r>
+      <w:proofErr w:type="gramEnd"/>
+      <w:r>
+        <w:rPr>
+          <w:sz w:val="28"/>
+          <w:szCs w:val="28"/>
+        </w:rPr>
+        <w:t xml:space="preserve"> adequate facilities to complete the project.</w:t>
       </w:r>
     </w:p>
     <w:p>
@@ -1111,14 +1187,30 @@
           <w:sz w:val="28"/>
           <w:szCs w:val="28"/>
         </w:rPr>
-        <w:t xml:space="preserve">We are immensely grateful to Head of Information Technology, </w:t>
-      </w:r>
-      <w:r>
-        <w:rPr>
-          <w:sz w:val="28"/>
-          <w:szCs w:val="28"/>
-        </w:rPr>
-        <w:t xml:space="preserve">                                      </w:t>
+        <w:t xml:space="preserve">We are immensely grateful to Head of Information </w:t>
+      </w:r>
+      <w:proofErr w:type="gramStart"/>
+      <w:r>
+        <w:rPr>
+          <w:sz w:val="28"/>
+          <w:szCs w:val="28"/>
+        </w:rPr>
+        <w:t xml:space="preserve">Technology, </w:t>
+      </w:r>
+      <w:r>
+        <w:rPr>
+          <w:sz w:val="28"/>
+          <w:szCs w:val="28"/>
+        </w:rPr>
+        <w:t xml:space="preserve">  </w:t>
+      </w:r>
+      <w:proofErr w:type="gramEnd"/>
+      <w:r>
+        <w:rPr>
+          <w:sz w:val="28"/>
+          <w:szCs w:val="28"/>
+        </w:rPr>
+        <w:t xml:space="preserve">                                    </w:t>
       </w:r>
       <w:r>
         <w:rPr>
@@ -1127,8 +1219,21 @@
           <w:sz w:val="28"/>
           <w:szCs w:val="28"/>
         </w:rPr>
-        <w:t>Dr. J. Akilandeswari</w:t>
-      </w:r>
+        <w:t xml:space="preserve">Dr. J. </w:t>
+      </w:r>
+      <w:proofErr w:type="spellStart"/>
+      <w:proofErr w:type="gramStart"/>
+      <w:r>
+        <w:rPr>
+          <w:b/>
+          <w:bCs/>
+          <w:sz w:val="28"/>
+          <w:szCs w:val="28"/>
+        </w:rPr>
+        <w:t>Akilandeswari</w:t>
+      </w:r>
+      <w:proofErr w:type="spellEnd"/>
+      <w:proofErr w:type="gramEnd"/>
       <w:r>
         <w:rPr>
           <w:sz w:val="28"/>
@@ -1152,7 +1257,39 @@
           <w:sz w:val="28"/>
           <w:szCs w:val="28"/>
         </w:rPr>
-        <w:t>We extend our deepest gratitude to our project Incharge &lt;&lt;Faculty Name&gt;&gt; for her/his unwavering support and valuable guidance throughout project work. His/Her expertise and patience were invaluable to us, and we are truly grateful for her/his remarkable contributions and valuable guidance and fruitful discussions throughout the course of the project work.</w:t>
+        <w:t xml:space="preserve">We extend our deepest gratitude to our project </w:t>
+      </w:r>
+      <w:proofErr w:type="spellStart"/>
+      <w:r>
+        <w:rPr>
+          <w:sz w:val="28"/>
+          <w:szCs w:val="28"/>
+        </w:rPr>
+        <w:t>Incharge</w:t>
+      </w:r>
+      <w:proofErr w:type="spellEnd"/>
+      <w:r>
+        <w:rPr>
+          <w:sz w:val="28"/>
+          <w:szCs w:val="28"/>
+        </w:rPr>
+        <w:t xml:space="preserve"> &lt;&lt;Faculty Name&gt;&gt; for her/his unwavering support and valuable guidance throughout project work. </w:t>
+      </w:r>
+      <w:proofErr w:type="spellStart"/>
+      <w:r>
+        <w:rPr>
+          <w:sz w:val="28"/>
+          <w:szCs w:val="28"/>
+        </w:rPr>
+        <w:t>His/Her</w:t>
+      </w:r>
+      <w:proofErr w:type="spellEnd"/>
+      <w:r>
+        <w:rPr>
+          <w:sz w:val="28"/>
+          <w:szCs w:val="28"/>
+        </w:rPr>
+        <w:t xml:space="preserve"> expertise and patience were invaluable to us, and we are truly grateful for her/his remarkable contributions and valuable guidance and fruitful discussions throughout the course of the project work.</w:t>
       </w:r>
     </w:p>
     <w:p>
@@ -4779,6 +4916,7 @@
   <w:style w:type="character" w:default="1" w:styleId="DefaultParagraphFont">
     <w:name w:val="Default Paragraph Font"/>
     <w:uiPriority w:val="1"/>
+    <w:semiHidden/>
     <w:unhideWhenUsed/>
   </w:style>
   <w:style w:type="table" w:default="1" w:styleId="TableNormal">

</xml_diff>